<commit_message>
fix(testsheet): align 33kV canonical columns, LTX meter routing, and RAW DATA architecture
</commit_message>
<xml_diff>
--- a/templates/FULL REPORT/executive_summary_census.docx
+++ b/templates/FULL REPORT/executive_summary_census.docx
@@ -15,8 +15,8 @@
       </w:pPr>
       <w:r>
         <w:rPr>
+          <w:rFonts w:asciiTheme="minorHAnsi" w:hAnsiTheme="minorHAnsi" w:cstheme="minorHAnsi"/>
           <w:b/>
-          <w:rFonts w:asciiTheme="minorHAnsi" w:hAnsiTheme="minorHAnsi" w:cstheme="minorHAnsi"/>
           <w:color w:val="auto"/>
         </w:rPr>
         <w:t>EXECUTIVE SUMMARY</w:t>
@@ -36,7 +36,6 @@
         </w:tblBorders>
         <w:tblLayout w:type="fixed"/>
         <w:tblLook w:val="04A0" w:firstRow="1" w:lastRow="0" w:firstColumn="1" w:lastColumn="0" w:noHBand="0" w:noVBand="1"/>
-        <w:tblInd w:w="-856" w:type="dxa"/>
       </w:tblPr>
       <w:tblGrid>
         <w:gridCol w:w="679"/>
@@ -49,7 +48,8 @@
       </w:tblGrid>
       <w:tr>
         <w:trPr>
-          <w:trHeight w:val="564" w:hRule="atLeast"/>
+          <w:trHeight w:val="564"/>
+          <w:tblHeader/>
           <w:jc w:val="center"/>
         </w:trPr>
         <w:tc>
@@ -59,12 +59,9 @@
             <w:vAlign w:val="center"/>
             <w:hideMark/>
           </w:tcPr>
-          <w:bookmarkEnd w:id="0"/>
-          <w:bookmarkEnd w:id="1"/>
           <w:p>
             <w:pPr>
               <w:pStyle w:val="NoSpacing"/>
-              <w:spacing w:line="240" w:lineRule="auto" w:after="0"/>
               <w:jc w:val="center"/>
               <w:rPr>
                 <w:rFonts w:cstheme="minorHAnsi"/>
@@ -74,7 +71,7 @@
             </w:pPr>
             <w:r>
               <w:rPr>
-                <w:rFonts w:cstheme="minorHAnsi" w:ascii="Tahoma" w:hAnsi="Tahoma" w:cs="Tahoma"/>
+                <w:rFonts w:ascii="Tahoma" w:hAnsi="Tahoma" w:cstheme="minorHAnsi"/>
                 <w:b/>
                 <w:sz w:val="18"/>
                 <w:szCs w:val="18"/>
@@ -93,7 +90,6 @@
           <w:p>
             <w:pPr>
               <w:pStyle w:val="NoSpacing"/>
-              <w:spacing w:line="240" w:lineRule="auto" w:after="0"/>
               <w:jc w:val="center"/>
               <w:rPr>
                 <w:rFonts w:cstheme="minorHAnsi"/>
@@ -103,7 +99,7 @@
             </w:pPr>
             <w:r>
               <w:rPr>
-                <w:rFonts w:cstheme="minorHAnsi" w:ascii="Tahoma" w:hAnsi="Tahoma" w:cs="Tahoma"/>
+                <w:rFonts w:ascii="Tahoma" w:hAnsi="Tahoma" w:cstheme="minorHAnsi"/>
                 <w:b/>
                 <w:sz w:val="18"/>
                 <w:szCs w:val="18"/>
@@ -122,7 +118,6 @@
           <w:p>
             <w:pPr>
               <w:pStyle w:val="NoSpacing"/>
-              <w:spacing w:line="240" w:lineRule="auto" w:after="0"/>
               <w:jc w:val="center"/>
               <w:rPr>
                 <w:rFonts w:cstheme="minorHAnsi"/>
@@ -132,7 +127,7 @@
             </w:pPr>
             <w:r>
               <w:rPr>
-                <w:rFonts w:cstheme="minorHAnsi" w:ascii="Tahoma" w:hAnsi="Tahoma" w:cs="Tahoma"/>
+                <w:rFonts w:ascii="Tahoma" w:hAnsi="Tahoma" w:cstheme="minorHAnsi"/>
                 <w:b/>
                 <w:sz w:val="18"/>
                 <w:szCs w:val="18"/>
@@ -150,7 +145,6 @@
           <w:p>
             <w:pPr>
               <w:pStyle w:val="NoSpacing"/>
-              <w:spacing w:line="240" w:lineRule="auto" w:after="0"/>
               <w:jc w:val="center"/>
               <w:rPr>
                 <w:rFonts w:cstheme="minorHAnsi"/>
@@ -171,7 +165,6 @@
           <w:p>
             <w:pPr>
               <w:pStyle w:val="NoSpacing"/>
-              <w:spacing w:line="240" w:lineRule="auto" w:after="0"/>
               <w:jc w:val="center"/>
               <w:rPr>
                 <w:rFonts w:cstheme="minorHAnsi"/>
@@ -198,8 +191,8 @@
           </w:tcPr>
           <w:p>
             <w:pPr>
-              <w:jc w:val="center"/>
-              <w:spacing w:after="0" w:line="240" w:lineRule="auto"/>
+              <w:spacing w:after="0" w:line="240" w:lineRule="auto"/>
+              <w:jc w:val="center"/>
             </w:pPr>
             <w:r>
               <w:rPr>
@@ -220,8 +213,8 @@
           </w:tcPr>
           <w:p>
             <w:pPr>
-              <w:jc w:val="center"/>
-              <w:spacing w:after="0" w:line="240" w:lineRule="auto"/>
+              <w:spacing w:after="0" w:line="240" w:lineRule="auto"/>
+              <w:jc w:val="center"/>
             </w:pPr>
             <w:r>
               <w:rPr>
@@ -244,7 +237,6 @@
           <w:p>
             <w:pPr>
               <w:pStyle w:val="NoSpacing"/>
-              <w:spacing w:line="240" w:lineRule="auto" w:after="0"/>
               <w:jc w:val="center"/>
               <w:rPr>
                 <w:rFonts w:cstheme="minorHAnsi"/>
@@ -254,7 +246,7 @@
             </w:pPr>
             <w:r>
               <w:rPr>
-                <w:rFonts w:cstheme="minorHAnsi" w:ascii="Tahoma" w:hAnsi="Tahoma" w:cs="Tahoma"/>
+                <w:rFonts w:ascii="Tahoma" w:hAnsi="Tahoma" w:cstheme="minorHAnsi"/>
                 <w:b/>
                 <w:sz w:val="18"/>
                 <w:szCs w:val="18"/>
@@ -266,7 +258,7 @@
       </w:tr>
       <w:tr>
         <w:trPr>
-          <w:trHeight w:val="450" w:hRule="atLeast"/>
+          <w:trHeight w:val="450"/>
           <w:jc w:val="center"/>
         </w:trPr>
         <w:tc>
@@ -276,8 +268,8 @@
           </w:tcPr>
           <w:p>
             <w:pPr>
-              <w:jc w:val="center"/>
-              <w:spacing w:after="0" w:line="240" w:lineRule="auto"/>
+              <w:spacing w:after="0" w:line="240" w:lineRule="auto"/>
+              <w:jc w:val="center"/>
             </w:pPr>
             <w:r>
               <w:rPr>
@@ -294,14 +286,9 @@
           </w:tcPr>
           <w:p>
             <w:pPr>
-              <w:jc w:val="center"/>
-              <w:spacing w:after="0" w:line="240" w:lineRule="auto"/>
-            </w:pPr>
-            <w:r>
-              <w:rPr>
-                <w:rFonts w:ascii="Tahoma" w:hAnsi="Tahoma" w:cs="Tahoma"/>
-              </w:rPr>
-            </w:r>
+              <w:spacing w:after="0" w:line="240" w:lineRule="auto"/>
+              <w:jc w:val="center"/>
+            </w:pPr>
           </w:p>
         </w:tc>
         <w:tc>
@@ -311,14 +298,9 @@
           </w:tcPr>
           <w:p>
             <w:pPr>
-              <w:jc w:val="center"/>
-              <w:spacing w:after="0" w:line="240" w:lineRule="auto"/>
-            </w:pPr>
-            <w:r>
-              <w:rPr>
-                <w:rFonts w:ascii="Tahoma" w:hAnsi="Tahoma" w:cs="Tahoma"/>
-              </w:rPr>
-            </w:r>
+              <w:spacing w:after="0" w:line="240" w:lineRule="auto"/>
+              <w:jc w:val="center"/>
+            </w:pPr>
           </w:p>
         </w:tc>
         <w:tc>
@@ -328,14 +310,9 @@
           </w:tcPr>
           <w:p>
             <w:pPr>
-              <w:jc w:val="center"/>
-              <w:spacing w:after="0" w:line="240" w:lineRule="auto"/>
-            </w:pPr>
-            <w:r>
-              <w:rPr>
-                <w:rFonts w:ascii="Tahoma" w:hAnsi="Tahoma" w:cs="Tahoma"/>
-              </w:rPr>
-            </w:r>
+              <w:spacing w:after="0" w:line="240" w:lineRule="auto"/>
+              <w:jc w:val="center"/>
+            </w:pPr>
           </w:p>
         </w:tc>
         <w:tc>
@@ -345,14 +322,9 @@
           </w:tcPr>
           <w:p>
             <w:pPr>
-              <w:jc w:val="center"/>
-              <w:spacing w:after="0" w:line="240" w:lineRule="auto"/>
-            </w:pPr>
-            <w:r>
-              <w:rPr>
-                <w:rFonts w:ascii="Tahoma" w:hAnsi="Tahoma" w:cs="Tahoma"/>
-              </w:rPr>
-            </w:r>
+              <w:spacing w:after="0" w:line="240" w:lineRule="auto"/>
+              <w:jc w:val="center"/>
+            </w:pPr>
           </w:p>
         </w:tc>
         <w:tc>
@@ -362,14 +334,9 @@
           </w:tcPr>
           <w:p>
             <w:pPr>
-              <w:jc w:val="center"/>
-              <w:spacing w:after="0" w:line="240" w:lineRule="auto"/>
-            </w:pPr>
-            <w:r>
-              <w:rPr>
-                <w:rFonts w:ascii="Tahoma" w:hAnsi="Tahoma" w:cs="Tahoma"/>
-              </w:rPr>
-            </w:r>
+              <w:spacing w:after="0" w:line="240" w:lineRule="auto"/>
+              <w:jc w:val="center"/>
+            </w:pPr>
           </w:p>
         </w:tc>
         <w:tc>
@@ -380,20 +347,15 @@
           </w:tcPr>
           <w:p>
             <w:pPr>
-              <w:jc w:val="center"/>
-              <w:spacing w:after="0" w:line="240" w:lineRule="auto"/>
-            </w:pPr>
-            <w:r>
-              <w:rPr>
-                <w:rFonts w:ascii="Tahoma" w:hAnsi="Tahoma" w:cs="Tahoma"/>
-              </w:rPr>
-            </w:r>
+              <w:spacing w:after="0" w:line="240" w:lineRule="auto"/>
+              <w:jc w:val="center"/>
+            </w:pPr>
           </w:p>
         </w:tc>
       </w:tr>
       <w:tr>
         <w:trPr>
-          <w:trHeight w:val="450" w:hRule="atLeast"/>
+          <w:trHeight w:val="450"/>
           <w:jc w:val="center"/>
         </w:trPr>
         <w:tc>
@@ -403,8 +365,8 @@
           </w:tcPr>
           <w:p>
             <w:pPr>
-              <w:jc w:val="center"/>
-              <w:spacing w:after="0" w:line="240" w:lineRule="auto"/>
+              <w:spacing w:after="0" w:line="240" w:lineRule="auto"/>
+              <w:jc w:val="center"/>
             </w:pPr>
             <w:r>
               <w:rPr>
@@ -423,8 +385,8 @@
           </w:tcPr>
           <w:p>
             <w:pPr>
-              <w:jc w:val="center"/>
-              <w:spacing w:after="0" w:line="240" w:lineRule="auto"/>
+              <w:spacing w:after="0" w:line="240" w:lineRule="auto"/>
+              <w:jc w:val="center"/>
             </w:pPr>
             <w:r>
               <w:rPr>
@@ -443,8 +405,8 @@
           </w:tcPr>
           <w:p>
             <w:pPr>
-              <w:jc w:val="center"/>
-              <w:spacing w:after="0" w:line="240" w:lineRule="auto"/>
+              <w:spacing w:after="0" w:line="240" w:lineRule="auto"/>
+              <w:jc w:val="center"/>
             </w:pPr>
             <w:r>
               <w:rPr>
@@ -463,8 +425,8 @@
           </w:tcPr>
           <w:p>
             <w:pPr>
-              <w:jc w:val="center"/>
-              <w:spacing w:after="0" w:line="240" w:lineRule="auto"/>
+              <w:spacing w:after="0" w:line="240" w:lineRule="auto"/>
+              <w:jc w:val="center"/>
             </w:pPr>
             <w:r>
               <w:rPr>
@@ -483,8 +445,8 @@
           </w:tcPr>
           <w:p>
             <w:pPr>
-              <w:jc w:val="center"/>
-              <w:spacing w:after="0" w:line="240" w:lineRule="auto"/>
+              <w:spacing w:after="0" w:line="240" w:lineRule="auto"/>
+              <w:jc w:val="center"/>
             </w:pPr>
             <w:r>
               <w:rPr>
@@ -503,8 +465,8 @@
           </w:tcPr>
           <w:p>
             <w:pPr>
-              <w:jc w:val="center"/>
-              <w:spacing w:after="0" w:line="240" w:lineRule="auto"/>
+              <w:spacing w:after="0" w:line="240" w:lineRule="auto"/>
+              <w:jc w:val="center"/>
             </w:pPr>
             <w:r>
               <w:rPr>
@@ -523,8 +485,8 @@
           </w:tcPr>
           <w:p>
             <w:pPr>
-              <w:jc w:val="center"/>
-              <w:spacing w:after="0" w:line="240" w:lineRule="auto"/>
+              <w:spacing w:after="0" w:line="240" w:lineRule="auto"/>
+              <w:jc w:val="center"/>
             </w:pPr>
             <w:r>
               <w:rPr>
@@ -539,8 +501,8 @@
       </w:tr>
       <w:tr>
         <w:trPr>
+          <w:trHeight w:val="450"/>
           <w:jc w:val="center"/>
-          <w:trHeight w:val="450" w:hRule="atLeast"/>
         </w:trPr>
         <w:tc>
           <w:tcPr>
@@ -549,8 +511,8 @@
           </w:tcPr>
           <w:p>
             <w:pPr>
-              <w:jc w:val="center"/>
-              <w:spacing w:after="0" w:line="240" w:lineRule="auto"/>
+              <w:spacing w:after="0" w:line="240" w:lineRule="auto"/>
+              <w:jc w:val="center"/>
             </w:pPr>
             <w:r>
               <w:rPr>
@@ -567,14 +529,9 @@
           </w:tcPr>
           <w:p>
             <w:pPr>
-              <w:jc w:val="center"/>
-              <w:spacing w:after="0" w:line="240" w:lineRule="auto"/>
-            </w:pPr>
-            <w:r>
-              <w:rPr>
-                <w:rFonts w:ascii="Tahoma" w:hAnsi="Tahoma" w:cs="Tahoma"/>
-              </w:rPr>
-            </w:r>
+              <w:spacing w:after="0" w:line="240" w:lineRule="auto"/>
+              <w:jc w:val="center"/>
+            </w:pPr>
           </w:p>
         </w:tc>
         <w:tc>
@@ -584,14 +541,9 @@
           </w:tcPr>
           <w:p>
             <w:pPr>
-              <w:jc w:val="center"/>
-              <w:spacing w:after="0" w:line="240" w:lineRule="auto"/>
-            </w:pPr>
-            <w:r>
-              <w:rPr>
-                <w:rFonts w:ascii="Tahoma" w:hAnsi="Tahoma" w:cs="Tahoma"/>
-              </w:rPr>
-            </w:r>
+              <w:spacing w:after="0" w:line="240" w:lineRule="auto"/>
+              <w:jc w:val="center"/>
+            </w:pPr>
           </w:p>
         </w:tc>
         <w:tc>
@@ -601,14 +553,9 @@
           </w:tcPr>
           <w:p>
             <w:pPr>
-              <w:jc w:val="center"/>
-              <w:spacing w:after="0" w:line="240" w:lineRule="auto"/>
-            </w:pPr>
-            <w:r>
-              <w:rPr>
-                <w:rFonts w:ascii="Tahoma" w:hAnsi="Tahoma" w:cs="Tahoma"/>
-              </w:rPr>
-            </w:r>
+              <w:spacing w:after="0" w:line="240" w:lineRule="auto"/>
+              <w:jc w:val="center"/>
+            </w:pPr>
           </w:p>
         </w:tc>
         <w:tc>
@@ -618,14 +565,9 @@
           </w:tcPr>
           <w:p>
             <w:pPr>
-              <w:jc w:val="center"/>
-              <w:spacing w:after="0" w:line="240" w:lineRule="auto"/>
-            </w:pPr>
-            <w:r>
-              <w:rPr>
-                <w:rFonts w:ascii="Tahoma" w:hAnsi="Tahoma" w:cs="Tahoma"/>
-              </w:rPr>
-            </w:r>
+              <w:spacing w:after="0" w:line="240" w:lineRule="auto"/>
+              <w:jc w:val="center"/>
+            </w:pPr>
           </w:p>
         </w:tc>
         <w:tc>
@@ -635,14 +577,9 @@
           </w:tcPr>
           <w:p>
             <w:pPr>
-              <w:jc w:val="center"/>
-              <w:spacing w:after="0" w:line="240" w:lineRule="auto"/>
-            </w:pPr>
-            <w:r>
-              <w:rPr>
-                <w:rFonts w:ascii="Tahoma" w:hAnsi="Tahoma" w:cs="Tahoma"/>
-              </w:rPr>
-            </w:r>
+              <w:spacing w:after="0" w:line="240" w:lineRule="auto"/>
+              <w:jc w:val="center"/>
+            </w:pPr>
           </w:p>
         </w:tc>
         <w:tc>
@@ -652,14 +589,9 @@
           </w:tcPr>
           <w:p>
             <w:pPr>
-              <w:jc w:val="center"/>
-              <w:spacing w:after="0" w:line="240" w:lineRule="auto"/>
-            </w:pPr>
-            <w:r>
-              <w:rPr>
-                <w:rFonts w:ascii="Tahoma" w:hAnsi="Tahoma" w:cs="Tahoma"/>
-              </w:rPr>
-            </w:r>
+              <w:spacing w:after="0" w:line="240" w:lineRule="auto"/>
+              <w:jc w:val="center"/>
+            </w:pPr>
           </w:p>
         </w:tc>
       </w:tr>

</xml_diff>